<commit_message>
sync: update custom skills from main
</commit_message>
<xml_diff>
--- a/general-sci-writing/templates/reference.docx
+++ b/general-sci-writing/templates/reference.docx
@@ -501,6 +501,9 @@
   <w:style w:type="paragraph" w:default="1" w:styleId="Normal">
     <w:name w:val="Normal"/>
     <w:qFormat/>
+    <w:pPr>
+      <w:spacing w:before="0" w:after="0"/>
+    </w:pPr>
     <w:rPr>
       <w:rFonts w:ascii="Times New Roman" w:hAnsi="Times New Roman" w:eastAsia="Times New Roman" w:cs="Times New Roman"/>
       <w:sz w:val="24"/>
@@ -512,7 +515,7 @@
     <w:link w:val="BodyTextChar"/>
     <w:qFormat/>
     <w:pPr>
-      <w:spacing w:before="180" w:after="180"/>
+      <w:spacing w:before="0" w:after="0"/>
     </w:pPr>
     <w:rPr>
       <w:rFonts w:ascii="Times New Roman" w:hAnsi="Times New Roman" w:eastAsia="Times New Roman" w:cs="Times New Roman"/>
@@ -524,6 +527,9 @@
     <w:basedOn w:val="BodyText"/>
     <w:next w:val="BodyText"/>
     <w:qFormat/>
+    <w:pPr>
+      <w:spacing w:before="0" w:after="0"/>
+    </w:pPr>
     <w:rPr>
       <w:rFonts w:ascii="Times New Roman" w:hAnsi="Times New Roman" w:eastAsia="Times New Roman" w:cs="Times New Roman"/>
       <w:sz w:val="24"/>
@@ -672,7 +678,9 @@
     <w:basedOn w:val="Normal"/>
     <w:next w:val="Bibliography"/>
     <w:qFormat/>
-    <w:pPr/>
+    <w:pPr>
+      <w:spacing w:before="0" w:after="120"/>
+    </w:pPr>
     <w:rPr>
       <w:rFonts w:ascii="Times New Roman" w:hAnsi="Times New Roman" w:eastAsia="Times New Roman" w:cs="Times New Roman"/>
       <w:sz w:val="24"/>

</xml_diff>